<commit_message>
ModSim reviewer: replace symbols the PDF font cannot show
Co-Authored-By: Claude Opus 5.5 <noreply@anthropic.com>
</commit_message>
<xml_diff>
--- a/Modeling and Simulation/PAMESA - ModSim Midterm Reviewer.docx
+++ b/Modeling and Simulation/PAMESA - ModSim Midterm Reviewer.docx
@@ -2554,7 +2554,7 @@
         <w:rPr>
           <w:b w:val="0"/>
         </w:rPr>
-        <w:t xml:space="preserve"> is a collection without duplicate elements; ∅ is empty. A subset contains only elements of a larger set. Union includes elements in either set; intersection includes elements in both; difference removes the second set; complement includes elements in the sample space outside the set. Finite sets have a terminating count; countable sets can be paired with positive integers.</w:t>
+        <w:t xml:space="preserve"> is a collection without duplicate elements; the empty set { } has no elements. A subset contains only elements of a larger set. Union includes elements in either set; intersection includes elements in both; difference removes the second set; complement includes elements in the sample space outside the set. Finite sets have a terminating count; countable sets can be paired with positive integers.</w:t>
       </w:r>
     </w:p>
     <w:p>
@@ -2571,7 +2571,7 @@
         <w:rPr>
           <w:b w:val="0"/>
         </w:rPr>
-        <w:t xml:space="preserve"> A={2,4,10}, B={4,6,8,10}, S={2,4,6,8,10,12}. A∪B={2,4,6,8,10}; A∩B={4,10}; A−B={2}; B−A={6,8}; Aᶜ={6,8,12}.</w:t>
+        <w:t xml:space="preserve"> A={2,4,10}, B={4,6,8,10}, S={2,4,6,8,10,12}. A union B ={2,4,6,8,10}; A∩B={4,10}; A−B={2}; B−A={6,8}; Aᶜ={6,8,12}.</w:t>
       </w:r>
     </w:p>
     <w:p>
@@ -2710,7 +2710,7 @@
               <w:rPr>
                 <w:b w:val="0"/>
               </w:rPr>
-              <w:t>∅</w:t>
+              <w:t>{ } (empty set)</w:t>
             </w:r>
           </w:p>
         </w:tc>

</xml_diff>